<commit_message>
feat(template): P12 risk-prompt template override UX (T01-T04) and preview pipeline
Land template-scoped risk-prompt override API/UX, decision dialog effective-config wiring,
preview PDF artifacts with page numbering, DOCX normalization, variable compute expressions,
and template test-preview authoring surfaces. Gates: mvn verify 609, frontend 569 Vitest.
Slice T05 Playwright pending.

Co-authored-by: Cursor <cursoragent@cursor.com>
</commit_message>
<xml_diff>
--- a/deploy/demo-fol/assets/wholesale-fol-master.docx
+++ b/deploy/demo-fol/assets/wholesale-fol-master.docx
@@ -1,6 +1,6 @@
 
 <file path=word/document.xml><?xml version="1.0" encoding="utf-8"?>
-<w:document xmlns:w="http://schemas.openxmlformats.org/wordprocessingml/2006/main" xmlns:r="http://schemas.openxmlformats.org/officeDocument/2006/relationships">
+<w:document xmlns:w="http://schemas.openxmlformats.org/wordprocessingml/2006/main">
   <w:body>
     <w:p>
       <w:pPr>
@@ -71,16 +71,6 @@
     </w:p>
     <w:p>
       <w:r>
-        <w:rPr>
-          <w:sz w:val="20"/>
-          <w:rFonts w:ascii="Calibri" w:hAnsi="Calibri" w:cs="Calibri" w:eastAsia="Calibri"/>
-          <w:color w:val="444444"/>
-        </w:rPr>
-        <w:t>Section-level anchor in the master layout container. Long-form clause text is composed from approved standard modules at template authoring time.</w:t>
-      </w:r>
-    </w:p>
-    <w:p>
-      <w:r>
         <w:t>{{anchor:FOL_HEADER}}</w:t>
       </w:r>
     </w:p>
@@ -97,16 +87,6 @@
     </w:p>
     <w:p>
       <w:r>
-        <w:rPr>
-          <w:sz w:val="20"/>
-          <w:rFonts w:ascii="Calibri" w:hAnsi="Calibri" w:cs="Calibri" w:eastAsia="Calibri"/>
-          <w:color w:val="444444"/>
-        </w:rPr>
-        <w:t>Section-level anchor in the master layout container. Long-form clause text is composed from approved standard modules at template authoring time.</w:t>
-      </w:r>
-    </w:p>
-    <w:p>
-      <w:r>
         <w:t>{{anchor:FOL_FACILITY_SUMMARY}}</w:t>
       </w:r>
     </w:p>
@@ -123,16 +103,6 @@
     </w:p>
     <w:p>
       <w:r>
-        <w:rPr>
-          <w:sz w:val="20"/>
-          <w:rFonts w:ascii="Calibri" w:hAnsi="Calibri" w:cs="Calibri" w:eastAsia="Calibri"/>
-          <w:color w:val="444444"/>
-        </w:rPr>
-        <w:t>Section-level anchor in the master layout container. Long-form clause text is composed from approved standard modules at template authoring time.</w:t>
-      </w:r>
-    </w:p>
-    <w:p>
-      <w:r>
         <w:t>{{anchor:FOL_SEC_01}}</w:t>
       </w:r>
     </w:p>
@@ -149,16 +119,6 @@
     </w:p>
     <w:p>
       <w:r>
-        <w:rPr>
-          <w:sz w:val="20"/>
-          <w:rFonts w:ascii="Calibri" w:hAnsi="Calibri" w:cs="Calibri" w:eastAsia="Calibri"/>
-          <w:color w:val="444444"/>
-        </w:rPr>
-        <w:t>Section-level anchor in the master layout container. Long-form clause text is composed from approved standard modules at template authoring time.</w:t>
-      </w:r>
-    </w:p>
-    <w:p>
-      <w:r>
         <w:t>{{anchor:FOL_SEC_02}}</w:t>
       </w:r>
     </w:p>
@@ -175,16 +135,6 @@
     </w:p>
     <w:p>
       <w:r>
-        <w:rPr>
-          <w:sz w:val="20"/>
-          <w:rFonts w:ascii="Calibri" w:hAnsi="Calibri" w:cs="Calibri" w:eastAsia="Calibri"/>
-          <w:color w:val="444444"/>
-        </w:rPr>
-        <w:t>Section-level anchor in the master layout container. Long-form clause text is composed from approved standard modules at template authoring time.</w:t>
-      </w:r>
-    </w:p>
-    <w:p>
-      <w:r>
         <w:t>{{anchor:FOL_SEC_03}}</w:t>
       </w:r>
     </w:p>
@@ -201,16 +151,6 @@
     </w:p>
     <w:p>
       <w:r>
-        <w:rPr>
-          <w:sz w:val="20"/>
-          <w:rFonts w:ascii="Calibri" w:hAnsi="Calibri" w:cs="Calibri" w:eastAsia="Calibri"/>
-          <w:color w:val="444444"/>
-        </w:rPr>
-        <w:t>Section-level anchor in the master layout container. Long-form clause text is composed from approved standard modules at template authoring time.</w:t>
-      </w:r>
-    </w:p>
-    <w:p>
-      <w:r>
         <w:t>{{anchor:FOL_SEC_04}}</w:t>
       </w:r>
     </w:p>
@@ -227,16 +167,6 @@
     </w:p>
     <w:p>
       <w:r>
-        <w:rPr>
-          <w:sz w:val="20"/>
-          <w:rFonts w:ascii="Calibri" w:hAnsi="Calibri" w:cs="Calibri" w:eastAsia="Calibri"/>
-          <w:color w:val="444444"/>
-        </w:rPr>
-        <w:t>Section-level anchor in the master layout container. Long-form clause text is composed from approved standard modules at template authoring time.</w:t>
-      </w:r>
-    </w:p>
-    <w:p>
-      <w:r>
         <w:t>{{anchor:FOL_SEC_05}}</w:t>
       </w:r>
     </w:p>
@@ -253,16 +183,6 @@
     </w:p>
     <w:p>
       <w:r>
-        <w:rPr>
-          <w:sz w:val="20"/>
-          <w:rFonts w:ascii="Calibri" w:hAnsi="Calibri" w:cs="Calibri" w:eastAsia="Calibri"/>
-          <w:color w:val="444444"/>
-        </w:rPr>
-        <w:t>Section-level anchor in the master layout container. Long-form clause text is composed from approved standard modules at template authoring time.</w:t>
-      </w:r>
-    </w:p>
-    <w:p>
-      <w:r>
         <w:t>{{anchor:FOL_SEC_06}}</w:t>
       </w:r>
     </w:p>
@@ -279,16 +199,6 @@
     </w:p>
     <w:p>
       <w:r>
-        <w:rPr>
-          <w:sz w:val="20"/>
-          <w:rFonts w:ascii="Calibri" w:hAnsi="Calibri" w:cs="Calibri" w:eastAsia="Calibri"/>
-          <w:color w:val="444444"/>
-        </w:rPr>
-        <w:t>Section-level anchor in the master layout container. Long-form clause text is composed from approved standard modules at template authoring time.</w:t>
-      </w:r>
-    </w:p>
-    <w:p>
-      <w:r>
         <w:t>{{anchor:FOL_SEC_07}}</w:t>
       </w:r>
     </w:p>
@@ -305,16 +215,6 @@
     </w:p>
     <w:p>
       <w:r>
-        <w:rPr>
-          <w:sz w:val="20"/>
-          <w:rFonts w:ascii="Calibri" w:hAnsi="Calibri" w:cs="Calibri" w:eastAsia="Calibri"/>
-          <w:color w:val="444444"/>
-        </w:rPr>
-        <w:t>Section-level anchor in the master layout container. Long-form clause text is composed from approved standard modules at template authoring time.</w:t>
-      </w:r>
-    </w:p>
-    <w:p>
-      <w:r>
         <w:t>{{anchor:FOL_SEC_08}}</w:t>
       </w:r>
     </w:p>
@@ -331,16 +231,6 @@
     </w:p>
     <w:p>
       <w:r>
-        <w:rPr>
-          <w:sz w:val="20"/>
-          <w:rFonts w:ascii="Calibri" w:hAnsi="Calibri" w:cs="Calibri" w:eastAsia="Calibri"/>
-          <w:color w:val="444444"/>
-        </w:rPr>
-        <w:t>Section-level anchor in the master layout container. Long-form clause text is composed from approved standard modules at template authoring time.</w:t>
-      </w:r>
-    </w:p>
-    <w:p>
-      <w:r>
         <w:t>{{anchor:FOL_SEC_09}}</w:t>
       </w:r>
     </w:p>
@@ -357,16 +247,6 @@
     </w:p>
     <w:p>
       <w:r>
-        <w:rPr>
-          <w:sz w:val="20"/>
-          <w:rFonts w:ascii="Calibri" w:hAnsi="Calibri" w:cs="Calibri" w:eastAsia="Calibri"/>
-          <w:color w:val="444444"/>
-        </w:rPr>
-        <w:t>Section-level anchor in the master layout container. Long-form clause text is composed from approved standard modules at template authoring time.</w:t>
-      </w:r>
-    </w:p>
-    <w:p>
-      <w:r>
         <w:t>{{anchor:FOL_SEC_10}}</w:t>
       </w:r>
     </w:p>
@@ -383,16 +263,6 @@
     </w:p>
     <w:p>
       <w:r>
-        <w:rPr>
-          <w:sz w:val="20"/>
-          <w:rFonts w:ascii="Calibri" w:hAnsi="Calibri" w:cs="Calibri" w:eastAsia="Calibri"/>
-          <w:color w:val="444444"/>
-        </w:rPr>
-        <w:t>Section-level anchor in the master layout container. Long-form clause text is composed from approved standard modules at template authoring time.</w:t>
-      </w:r>
-    </w:p>
-    <w:p>
-      <w:r>
         <w:t>{{anchor:FOL_SEC_11}}</w:t>
       </w:r>
     </w:p>
@@ -409,16 +279,6 @@
     </w:p>
     <w:p>
       <w:r>
-        <w:rPr>
-          <w:sz w:val="20"/>
-          <w:rFonts w:ascii="Calibri" w:hAnsi="Calibri" w:cs="Calibri" w:eastAsia="Calibri"/>
-          <w:color w:val="444444"/>
-        </w:rPr>
-        <w:t>Section-level anchor in the master layout container. Long-form clause text is composed from approved standard modules at template authoring time.</w:t>
-      </w:r>
-    </w:p>
-    <w:p>
-      <w:r>
         <w:t>{{anchor:FOL_SEC_12}}</w:t>
       </w:r>
     </w:p>
@@ -435,16 +295,6 @@
     </w:p>
     <w:p>
       <w:r>
-        <w:rPr>
-          <w:sz w:val="20"/>
-          <w:rFonts w:ascii="Calibri" w:hAnsi="Calibri" w:cs="Calibri" w:eastAsia="Calibri"/>
-          <w:color w:val="444444"/>
-        </w:rPr>
-        <w:t>Section-level anchor in the master layout container. Long-form clause text is composed from approved standard modules at template authoring time.</w:t>
-      </w:r>
-    </w:p>
-    <w:p>
-      <w:r>
         <w:t>{{anchor:FOL_SEC_13}}</w:t>
       </w:r>
     </w:p>
@@ -461,16 +311,6 @@
     </w:p>
     <w:p>
       <w:r>
-        <w:rPr>
-          <w:sz w:val="20"/>
-          <w:rFonts w:ascii="Calibri" w:hAnsi="Calibri" w:cs="Calibri" w:eastAsia="Calibri"/>
-          <w:color w:val="444444"/>
-        </w:rPr>
-        <w:t>Section-level anchor in the master layout container. Long-form clause text is composed from approved standard modules at template authoring time.</w:t>
-      </w:r>
-    </w:p>
-    <w:p>
-      <w:r>
         <w:t>{{anchor:FOL_SEC_14}}</w:t>
       </w:r>
     </w:p>
@@ -487,16 +327,6 @@
     </w:p>
     <w:p>
       <w:r>
-        <w:rPr>
-          <w:sz w:val="20"/>
-          <w:rFonts w:ascii="Calibri" w:hAnsi="Calibri" w:cs="Calibri" w:eastAsia="Calibri"/>
-          <w:color w:val="444444"/>
-        </w:rPr>
-        <w:t>Section-level anchor in the master layout container. Long-form clause text is composed from approved standard modules at template authoring time.</w:t>
-      </w:r>
-    </w:p>
-    <w:p>
-      <w:r>
         <w:t>{{anchor:FOL_SEC_15}}</w:t>
       </w:r>
     </w:p>
@@ -513,16 +343,6 @@
     </w:p>
     <w:p>
       <w:r>
-        <w:rPr>
-          <w:sz w:val="20"/>
-          <w:rFonts w:ascii="Calibri" w:hAnsi="Calibri" w:cs="Calibri" w:eastAsia="Calibri"/>
-          <w:color w:val="444444"/>
-        </w:rPr>
-        <w:t>Section-level anchor in the master layout container. Long-form clause text is composed from approved standard modules at template authoring time.</w:t>
-      </w:r>
-    </w:p>
-    <w:p>
-      <w:r>
         <w:t>{{anchor:FOL_SEC_16}}</w:t>
       </w:r>
     </w:p>
@@ -539,16 +359,6 @@
     </w:p>
     <w:p>
       <w:r>
-        <w:rPr>
-          <w:sz w:val="20"/>
-          <w:rFonts w:ascii="Calibri" w:hAnsi="Calibri" w:cs="Calibri" w:eastAsia="Calibri"/>
-          <w:color w:val="444444"/>
-        </w:rPr>
-        <w:t>Section-level anchor in the master layout container. Long-form clause text is composed from approved standard modules at template authoring time.</w:t>
-      </w:r>
-    </w:p>
-    <w:p>
-      <w:r>
         <w:t>{{anchor:FOL_SEC_17}}</w:t>
       </w:r>
     </w:p>
@@ -565,16 +375,6 @@
     </w:p>
     <w:p>
       <w:r>
-        <w:rPr>
-          <w:sz w:val="20"/>
-          <w:rFonts w:ascii="Calibri" w:hAnsi="Calibri" w:cs="Calibri" w:eastAsia="Calibri"/>
-          <w:color w:val="444444"/>
-        </w:rPr>
-        <w:t>Section-level anchor in the master layout container. Long-form clause text is composed from approved standard modules at template authoring time.</w:t>
-      </w:r>
-    </w:p>
-    <w:p>
-      <w:r>
         <w:t>{{anchor:FOL_SEC_18}}</w:t>
       </w:r>
     </w:p>
@@ -591,16 +391,6 @@
     </w:p>
     <w:p>
       <w:r>
-        <w:rPr>
-          <w:sz w:val="20"/>
-          <w:rFonts w:ascii="Calibri" w:hAnsi="Calibri" w:cs="Calibri" w:eastAsia="Calibri"/>
-          <w:color w:val="444444"/>
-        </w:rPr>
-        <w:t>Section-level anchor in the master layout container. Long-form clause text is composed from approved standard modules at template authoring time.</w:t>
-      </w:r>
-    </w:p>
-    <w:p>
-      <w:r>
         <w:t>{{anchor:FOL_SEC_19}}</w:t>
       </w:r>
     </w:p>
@@ -617,16 +407,6 @@
     </w:p>
     <w:p>
       <w:r>
-        <w:rPr>
-          <w:sz w:val="20"/>
-          <w:rFonts w:ascii="Calibri" w:hAnsi="Calibri" w:cs="Calibri" w:eastAsia="Calibri"/>
-          <w:color w:val="444444"/>
-        </w:rPr>
-        <w:t>Section-level anchor in the master layout container. Long-form clause text is composed from approved standard modules at template authoring time.</w:t>
-      </w:r>
-    </w:p>
-    <w:p>
-      <w:r>
         <w:t>{{anchor:FOL_SEC_20}}</w:t>
       </w:r>
     </w:p>
@@ -643,16 +423,6 @@
     </w:p>
     <w:p>
       <w:r>
-        <w:rPr>
-          <w:sz w:val="20"/>
-          <w:rFonts w:ascii="Calibri" w:hAnsi="Calibri" w:cs="Calibri" w:eastAsia="Calibri"/>
-          <w:color w:val="444444"/>
-        </w:rPr>
-        <w:t>Section-level anchor in the master layout container. Long-form clause text is composed from approved standard modules at template authoring time.</w:t>
-      </w:r>
-    </w:p>
-    <w:p>
-      <w:r>
         <w:t>{{anchor:FOL_SEC_21}}</w:t>
       </w:r>
     </w:p>
@@ -669,16 +439,6 @@
     </w:p>
     <w:p>
       <w:r>
-        <w:rPr>
-          <w:sz w:val="20"/>
-          <w:rFonts w:ascii="Calibri" w:hAnsi="Calibri" w:cs="Calibri" w:eastAsia="Calibri"/>
-          <w:color w:val="444444"/>
-        </w:rPr>
-        <w:t>Section-level anchor in the master layout container. Long-form clause text is composed from approved standard modules at template authoring time.</w:t>
-      </w:r>
-    </w:p>
-    <w:p>
-      <w:r>
         <w:t>{{anchor:FOL_SEC_22}}</w:t>
       </w:r>
     </w:p>
@@ -695,16 +455,6 @@
     </w:p>
     <w:p>
       <w:r>
-        <w:rPr>
-          <w:sz w:val="20"/>
-          <w:rFonts w:ascii="Calibri" w:hAnsi="Calibri" w:cs="Calibri" w:eastAsia="Calibri"/>
-          <w:color w:val="444444"/>
-        </w:rPr>
-        <w:t>Section-level anchor in the master layout container. Long-form clause text is composed from approved standard modules at template authoring time.</w:t>
-      </w:r>
-    </w:p>
-    <w:p>
-      <w:r>
         <w:t>{{anchor:FOL_SEC_23}}</w:t>
       </w:r>
     </w:p>
@@ -721,16 +471,6 @@
     </w:p>
     <w:p>
       <w:r>
-        <w:rPr>
-          <w:sz w:val="20"/>
-          <w:rFonts w:ascii="Calibri" w:hAnsi="Calibri" w:cs="Calibri" w:eastAsia="Calibri"/>
-          <w:color w:val="444444"/>
-        </w:rPr>
-        <w:t>Section-level anchor in the master layout container. Long-form clause text is composed from approved standard modules at template authoring time.</w:t>
-      </w:r>
-    </w:p>
-    <w:p>
-      <w:r>
         <w:t>{{anchor:FOL_SEC_24}}</w:t>
       </w:r>
     </w:p>
@@ -747,16 +487,6 @@
     </w:p>
     <w:p>
       <w:r>
-        <w:rPr>
-          <w:sz w:val="20"/>
-          <w:rFonts w:ascii="Calibri" w:hAnsi="Calibri" w:cs="Calibri" w:eastAsia="Calibri"/>
-          <w:color w:val="444444"/>
-        </w:rPr>
-        <w:t>Section-level anchor in the master layout container. Long-form clause text is composed from approved standard modules at template authoring time.</w:t>
-      </w:r>
-    </w:p>
-    <w:p>
-      <w:r>
         <w:t>{{anchor:FOL_SEC_25}}</w:t>
       </w:r>
     </w:p>
@@ -773,16 +503,6 @@
     </w:p>
     <w:p>
       <w:r>
-        <w:rPr>
-          <w:sz w:val="20"/>
-          <w:rFonts w:ascii="Calibri" w:hAnsi="Calibri" w:cs="Calibri" w:eastAsia="Calibri"/>
-          <w:color w:val="444444"/>
-        </w:rPr>
-        <w:t>Section-level anchor in the master layout container. Long-form clause text is composed from approved standard modules at template authoring time.</w:t>
-      </w:r>
-    </w:p>
-    <w:p>
-      <w:r>
         <w:t>{{anchor:FOL_SEC_26}}</w:t>
       </w:r>
     </w:p>
@@ -799,16 +519,6 @@
     </w:p>
     <w:p>
       <w:r>
-        <w:rPr>
-          <w:sz w:val="20"/>
-          <w:rFonts w:ascii="Calibri" w:hAnsi="Calibri" w:cs="Calibri" w:eastAsia="Calibri"/>
-          <w:color w:val="444444"/>
-        </w:rPr>
-        <w:t>Section-level anchor in the master layout container. Long-form clause text is composed from approved standard modules at template authoring time.</w:t>
-      </w:r>
-    </w:p>
-    <w:p>
-      <w:r>
         <w:t>{{anchor:FOL_SEC_27}}</w:t>
       </w:r>
     </w:p>
@@ -825,16 +535,6 @@
     </w:p>
     <w:p>
       <w:r>
-        <w:rPr>
-          <w:sz w:val="20"/>
-          <w:rFonts w:ascii="Calibri" w:hAnsi="Calibri" w:cs="Calibri" w:eastAsia="Calibri"/>
-          <w:color w:val="444444"/>
-        </w:rPr>
-        <w:t>Section-level anchor in the master layout container. Long-form clause text is composed from approved standard modules at template authoring time.</w:t>
-      </w:r>
-    </w:p>
-    <w:p>
-      <w:r>
         <w:t>{{anchor:FOL_SEC_28}}</w:t>
       </w:r>
     </w:p>
@@ -851,16 +551,6 @@
     </w:p>
     <w:p>
       <w:r>
-        <w:rPr>
-          <w:sz w:val="20"/>
-          <w:rFonts w:ascii="Calibri" w:hAnsi="Calibri" w:cs="Calibri" w:eastAsia="Calibri"/>
-          <w:color w:val="444444"/>
-        </w:rPr>
-        <w:t>Section-level anchor in the master layout container. Long-form clause text is composed from approved standard modules at template authoring time.</w:t>
-      </w:r>
-    </w:p>
-    <w:p>
-      <w:r>
         <w:t>{{anchor:FOL_SEC_29}}</w:t>
       </w:r>
     </w:p>
@@ -877,16 +567,6 @@
     </w:p>
     <w:p>
       <w:r>
-        <w:rPr>
-          <w:sz w:val="20"/>
-          <w:rFonts w:ascii="Calibri" w:hAnsi="Calibri" w:cs="Calibri" w:eastAsia="Calibri"/>
-          <w:color w:val="444444"/>
-        </w:rPr>
-        <w:t>Section-level anchor in the master layout container. Long-form clause text is composed from approved standard modules at template authoring time.</w:t>
-      </w:r>
-    </w:p>
-    <w:p>
-      <w:r>
         <w:t>{{anchor:FOL_SEC_30}}</w:t>
       </w:r>
     </w:p>
@@ -903,16 +583,6 @@
     </w:p>
     <w:p>
       <w:r>
-        <w:rPr>
-          <w:sz w:val="20"/>
-          <w:rFonts w:ascii="Calibri" w:hAnsi="Calibri" w:cs="Calibri" w:eastAsia="Calibri"/>
-          <w:color w:val="444444"/>
-        </w:rPr>
-        <w:t>Section-level anchor in the master layout container. Long-form clause text is composed from approved standard modules at template authoring time.</w:t>
-      </w:r>
-    </w:p>
-    <w:p>
-      <w:r>
         <w:t>{{anchor:FOL_SCH_01}}</w:t>
       </w:r>
     </w:p>
@@ -929,16 +599,6 @@
     </w:p>
     <w:p>
       <w:r>
-        <w:rPr>
-          <w:sz w:val="20"/>
-          <w:rFonts w:ascii="Calibri" w:hAnsi="Calibri" w:cs="Calibri" w:eastAsia="Calibri"/>
-          <w:color w:val="444444"/>
-        </w:rPr>
-        <w:t>Section-level anchor in the master layout container. Long-form clause text is composed from approved standard modules at template authoring time.</w:t>
-      </w:r>
-    </w:p>
-    <w:p>
-      <w:r>
         <w:t>{{anchor:FOL_SCH_02}}</w:t>
       </w:r>
     </w:p>
@@ -955,16 +615,6 @@
     </w:p>
     <w:p>
       <w:r>
-        <w:rPr>
-          <w:sz w:val="20"/>
-          <w:rFonts w:ascii="Calibri" w:hAnsi="Calibri" w:cs="Calibri" w:eastAsia="Calibri"/>
-          <w:color w:val="444444"/>
-        </w:rPr>
-        <w:t>Section-level anchor in the master layout container. Long-form clause text is composed from approved standard modules at template authoring time.</w:t>
-      </w:r>
-    </w:p>
-    <w:p>
-      <w:r>
         <w:t>{{anchor:FOL_SCH_03}}</w:t>
       </w:r>
     </w:p>
@@ -981,16 +631,6 @@
     </w:p>
     <w:p>
       <w:r>
-        <w:rPr>
-          <w:sz w:val="20"/>
-          <w:rFonts w:ascii="Calibri" w:hAnsi="Calibri" w:cs="Calibri" w:eastAsia="Calibri"/>
-          <w:color w:val="444444"/>
-        </w:rPr>
-        <w:t>Section-level anchor in the master layout container. Long-form clause text is composed from approved standard modules at template authoring time.</w:t>
-      </w:r>
-    </w:p>
-    <w:p>
-      <w:r>
         <w:t>{{anchor:FOL_SCH_04}}</w:t>
       </w:r>
     </w:p>
@@ -1007,16 +647,6 @@
     </w:p>
     <w:p>
       <w:r>
-        <w:rPr>
-          <w:sz w:val="20"/>
-          <w:rFonts w:ascii="Calibri" w:hAnsi="Calibri" w:cs="Calibri" w:eastAsia="Calibri"/>
-          <w:color w:val="444444"/>
-        </w:rPr>
-        <w:t>Section-level anchor in the master layout container. Long-form clause text is composed from approved standard modules at template authoring time.</w:t>
-      </w:r>
-    </w:p>
-    <w:p>
-      <w:r>
         <w:t>{{anchor:FOL_SCH_05}}</w:t>
       </w:r>
     </w:p>
@@ -1033,16 +663,6 @@
     </w:p>
     <w:p>
       <w:r>
-        <w:rPr>
-          <w:sz w:val="20"/>
-          <w:rFonts w:ascii="Calibri" w:hAnsi="Calibri" w:cs="Calibri" w:eastAsia="Calibri"/>
-          <w:color w:val="444444"/>
-        </w:rPr>
-        <w:t>Section-level anchor in the master layout container. Long-form clause text is composed from approved standard modules at template authoring time.</w:t>
-      </w:r>
-    </w:p>
-    <w:p>
-      <w:r>
         <w:t>{{anchor:FOL_SCH_06}}</w:t>
       </w:r>
     </w:p>
@@ -1059,16 +679,6 @@
     </w:p>
     <w:p>
       <w:r>
-        <w:rPr>
-          <w:sz w:val="20"/>
-          <w:rFonts w:ascii="Calibri" w:hAnsi="Calibri" w:cs="Calibri" w:eastAsia="Calibri"/>
-          <w:color w:val="444444"/>
-        </w:rPr>
-        <w:t>Section-level anchor in the master layout container. Long-form clause text is composed from approved standard modules at template authoring time.</w:t>
-      </w:r>
-    </w:p>
-    <w:p>
-      <w:r>
         <w:t>{{anchor:FOL_SIG_BORROWER}}</w:t>
       </w:r>
     </w:p>
@@ -1085,25 +695,15 @@
     </w:p>
     <w:p>
       <w:r>
-        <w:rPr>
-          <w:sz w:val="20"/>
-          <w:rFonts w:ascii="Calibri" w:hAnsi="Calibri" w:cs="Calibri" w:eastAsia="Calibri"/>
-          <w:color w:val="444444"/>
-        </w:rPr>
-        <w:t>Section-level anchor in the master layout container. Long-form clause text is composed from approved standard modules at template authoring time.</w:t>
-      </w:r>
-    </w:p>
-    <w:p>
-      <w:r>
         <w:t>{{anchor:FOL_SIG_LENDER}}</w:t>
       </w:r>
     </w:p>
     <w:p/>
     <w:sectPr>
-      <w:headerReference w:type="default" r:id="rId2"/>
-      <w:footerReference w:type="default" r:id="rId3"/>
-      <w:pgSz w:w="11906" w:h="16838"/>
-      <w:pgMar w:top="1440" w:bottom="1440" w:left="1701" w:right="1276" w:header="708" w:footer="708" w:gutter="0"/>
+      <main:headerReference xmlns:main="http://schemas.openxmlformats.org/wordprocessingml/2006/main" xmlns:rel="http://schemas.openxmlformats.org/officeDocument/2006/relationships" main:type="default" rel:id="rId2"/>
+      <main:footerReference xmlns:main="http://schemas.openxmlformats.org/wordprocessingml/2006/main" xmlns:rel="http://schemas.openxmlformats.org/officeDocument/2006/relationships" main:type="default" rel:id="rId3"/>
+      <main:pgSz xmlns:main="http://schemas.openxmlformats.org/wordprocessingml/2006/main" main:w="11906" main:h="16838"/>
+      <main:pgMar xmlns:main="http://schemas.openxmlformats.org/wordprocessingml/2006/main" main:top="1440" main:bottom="1440" main:left="1701" main:right="1276" main:header="708" main:footer="708" main:gutter="0"/>
     </w:sectPr>
   </w:body>
 </w:document>
@@ -1211,4 +811,34 @@
     </w:r>
   </w:p>
 </w:hdr>
+</file>
+
+<file path=word/styles.xml><?xml version="1.0" encoding="utf-8"?>
+<w:styles xmlns:w="http://schemas.openxmlformats.org/wordprocessingml/2006/main">
+  <w:docDefaults>
+    <w:rPrDefault>
+      <w:rPr>
+        <w:rFonts w:ascii="Calibri" w:hAnsi="Calibri" w:cs="Calibri" w:eastAsia="Calibri"/>
+        <w:sz w:val="22"/>
+        <w:szCs w:val="22"/>
+        <w:color w:val="000000"/>
+        <w:lang w:val="en-US"/>
+      </w:rPr>
+    </w:rPrDefault>
+    <w:pPrDefault>
+      <w:pPr/>
+    </w:pPrDefault>
+  </w:docDefaults>
+  <w:style w:type="paragraph" w:styleId="Normal" w:default="true">
+    <w:name w:val="Normal"/>
+    <w:qFormat/>
+    <w:rPr>
+      <w:rFonts w:ascii="Calibri" w:hAnsi="Calibri" w:cs="Calibri" w:eastAsia="Calibri"/>
+      <w:sz w:val="22"/>
+      <w:szCs w:val="22"/>
+      <w:color w:val="000000"/>
+      <w:lang w:val="en-US"/>
+    </w:rPr>
+  </w:style>
+</w:styles>
 </file>
</xml_diff>

<commit_message>
refactor(demo-fol): hybrid anchor IDs and shared catalog manifest
Centralize FOL catalog generation in fol-catalog-shared.ps1 with manifest-driven bindings, hybrid FOL_CLAUSE_* anchor IDs, and aligned E2E fixtures/helpers.

Co-authored-by: Cursor <cursoragent@cursor.com>
</commit_message>
<xml_diff>
--- a/deploy/demo-fol/assets/wholesale-fol-master.docx
+++ b/deploy/demo-fol/assets/wholesale-fol-master.docx
@@ -82,7 +82,7 @@
           <w:sz w:val="22"/>
           <w:rFonts w:ascii="Calibri" w:hAnsi="Calibri" w:cs="Calibri" w:eastAsia="Calibri"/>
         </w:rPr>
-        <w:t>Schedule — Facility Particulars (Summary)</w:t>
+        <w:t>Schedule 鈥?Facility Particulars (Summary)</w:t>
       </w:r>
     </w:p>
     <w:p>
@@ -103,7 +103,7 @@
     </w:p>
     <w:p>
       <w:r>
-        <w:t>{{anchor:FOL_SEC_01}}</w:t>
+        <w:t>{{anchor:FOL_CLAUSE_01_DEFINITIONS_AND_INTERPRETATION}}</w:t>
       </w:r>
     </w:p>
     <w:p/>
@@ -119,7 +119,7 @@
     </w:p>
     <w:p>
       <w:r>
-        <w:t>{{anchor:FOL_SEC_02}}</w:t>
+        <w:t>{{anchor:FOL_CLAUSE_02_THE_FACILITY}}</w:t>
       </w:r>
     </w:p>
     <w:p/>
@@ -135,7 +135,7 @@
     </w:p>
     <w:p>
       <w:r>
-        <w:t>{{anchor:FOL_SEC_03}}</w:t>
+        <w:t>{{anchor:FOL_CLAUSE_03_PURPOSE}}</w:t>
       </w:r>
     </w:p>
     <w:p/>
@@ -151,7 +151,7 @@
     </w:p>
     <w:p>
       <w:r>
-        <w:t>{{anchor:FOL_SEC_04}}</w:t>
+        <w:t>{{anchor:FOL_CLAUSE_04_CONDITIONS_OF_UTILISATION}}</w:t>
       </w:r>
     </w:p>
     <w:p/>
@@ -167,7 +167,7 @@
     </w:p>
     <w:p>
       <w:r>
-        <w:t>{{anchor:FOL_SEC_05}}</w:t>
+        <w:t>{{anchor:FOL_CLAUSE_05_UTILISATION}}</w:t>
       </w:r>
     </w:p>
     <w:p/>
@@ -183,7 +183,7 @@
     </w:p>
     <w:p>
       <w:r>
-        <w:t>{{anchor:FOL_SEC_06}}</w:t>
+        <w:t>{{anchor:FOL_CLAUSE_06_REPAYMENT}}</w:t>
       </w:r>
     </w:p>
     <w:p/>
@@ -199,7 +199,7 @@
     </w:p>
     <w:p>
       <w:r>
-        <w:t>{{anchor:FOL_SEC_07}}</w:t>
+        <w:t>{{anchor:FOL_CLAUSE_07_PREPAYMENT_AND_CANCELLATION}}</w:t>
       </w:r>
     </w:p>
     <w:p/>
@@ -215,7 +215,7 @@
     </w:p>
     <w:p>
       <w:r>
-        <w:t>{{anchor:FOL_SEC_08}}</w:t>
+        <w:t>{{anchor:FOL_CLAUSE_08_INTEREST}}</w:t>
       </w:r>
     </w:p>
     <w:p/>
@@ -231,7 +231,7 @@
     </w:p>
     <w:p>
       <w:r>
-        <w:t>{{anchor:FOL_SEC_09}}</w:t>
+        <w:t>{{anchor:FOL_CLAUSE_09_INTEREST_PERIODS}}</w:t>
       </w:r>
     </w:p>
     <w:p/>
@@ -247,7 +247,7 @@
     </w:p>
     <w:p>
       <w:r>
-        <w:t>{{anchor:FOL_SEC_10}}</w:t>
+        <w:t>{{anchor:FOL_CLAUSE_10_CHANGES_TO_THE_CALCULATION_OF_INTEREST}}</w:t>
       </w:r>
     </w:p>
     <w:p/>
@@ -263,7 +263,7 @@
     </w:p>
     <w:p>
       <w:r>
-        <w:t>{{anchor:FOL_SEC_11}}</w:t>
+        <w:t>{{anchor:FOL_CLAUSE_11_FEES}}</w:t>
       </w:r>
     </w:p>
     <w:p/>
@@ -279,7 +279,7 @@
     </w:p>
     <w:p>
       <w:r>
-        <w:t>{{anchor:FOL_SEC_12}}</w:t>
+        <w:t>{{anchor:FOL_CLAUSE_12_TAX_GROSS_UP_AND_INDEMNITIES}}</w:t>
       </w:r>
     </w:p>
     <w:p/>
@@ -295,7 +295,7 @@
     </w:p>
     <w:p>
       <w:r>
-        <w:t>{{anchor:FOL_SEC_13}}</w:t>
+        <w:t>{{anchor:FOL_CLAUSE_13_INCREASED_COSTS}}</w:t>
       </w:r>
     </w:p>
     <w:p/>
@@ -311,7 +311,7 @@
     </w:p>
     <w:p>
       <w:r>
-        <w:t>{{anchor:FOL_SEC_14}}</w:t>
+        <w:t>{{anchor:FOL_CLAUSE_14_OTHER_INDEMNITIES}}</w:t>
       </w:r>
     </w:p>
     <w:p/>
@@ -327,7 +327,7 @@
     </w:p>
     <w:p>
       <w:r>
-        <w:t>{{anchor:FOL_SEC_15}}</w:t>
+        <w:t>{{anchor:FOL_CLAUSE_15_MITIGATION_BY_THE_LENDERS}}</w:t>
       </w:r>
     </w:p>
     <w:p/>
@@ -343,7 +343,7 @@
     </w:p>
     <w:p>
       <w:r>
-        <w:t>{{anchor:FOL_SEC_16}}</w:t>
+        <w:t>{{anchor:FOL_CLAUSE_16_COSTS_AND_EXPENSES}}</w:t>
       </w:r>
     </w:p>
     <w:p/>
@@ -359,7 +359,7 @@
     </w:p>
     <w:p>
       <w:r>
-        <w:t>{{anchor:FOL_SEC_17}}</w:t>
+        <w:t>{{anchor:FOL_CLAUSE_17_GUARANTEE_AND_INDEMNITY}}</w:t>
       </w:r>
     </w:p>
     <w:p/>
@@ -375,7 +375,7 @@
     </w:p>
     <w:p>
       <w:r>
-        <w:t>{{anchor:FOL_SEC_18}}</w:t>
+        <w:t>{{anchor:FOL_CLAUSE_18_REPRESENTATIONS}}</w:t>
       </w:r>
     </w:p>
     <w:p/>
@@ -391,7 +391,7 @@
     </w:p>
     <w:p>
       <w:r>
-        <w:t>{{anchor:FOL_SEC_19}}</w:t>
+        <w:t>{{anchor:FOL_CLAUSE_19_INFORMATION_UNDERTAKINGS}}</w:t>
       </w:r>
     </w:p>
     <w:p/>
@@ -407,7 +407,7 @@
     </w:p>
     <w:p>
       <w:r>
-        <w:t>{{anchor:FOL_SEC_20}}</w:t>
+        <w:t>{{anchor:FOL_CLAUSE_20_FINANCIAL_COVENANTS}}</w:t>
       </w:r>
     </w:p>
     <w:p/>
@@ -423,7 +423,7 @@
     </w:p>
     <w:p>
       <w:r>
-        <w:t>{{anchor:FOL_SEC_21}}</w:t>
+        <w:t>{{anchor:FOL_CLAUSE_21_GENERAL_UNDERTAKINGS}}</w:t>
       </w:r>
     </w:p>
     <w:p/>
@@ -439,7 +439,7 @@
     </w:p>
     <w:p>
       <w:r>
-        <w:t>{{anchor:FOL_SEC_22}}</w:t>
+        <w:t>{{anchor:FOL_CLAUSE_22_EVENTS_OF_DEFAULT}}</w:t>
       </w:r>
     </w:p>
     <w:p/>
@@ -455,7 +455,7 @@
     </w:p>
     <w:p>
       <w:r>
-        <w:t>{{anchor:FOL_SEC_23}}</w:t>
+        <w:t>{{anchor:FOL_CLAUSE_23_CHANGES_TO_THE_LENDERS}}</w:t>
       </w:r>
     </w:p>
     <w:p/>
@@ -471,7 +471,7 @@
     </w:p>
     <w:p>
       <w:r>
-        <w:t>{{anchor:FOL_SEC_24}}</w:t>
+        <w:t>{{anchor:FOL_CLAUSE_24_THE_AGENT_AND_THE_ARRANGERS}}</w:t>
       </w:r>
     </w:p>
     <w:p/>
@@ -487,7 +487,7 @@
     </w:p>
     <w:p>
       <w:r>
-        <w:t>{{anchor:FOL_SEC_25}}</w:t>
+        <w:t>{{anchor:FOL_CLAUSE_25_CONDUCT_OF_BUSINESS_BY_THE_FINANCE_PARTIES}}</w:t>
       </w:r>
     </w:p>
     <w:p/>
@@ -503,7 +503,7 @@
     </w:p>
     <w:p>
       <w:r>
-        <w:t>{{anchor:FOL_SEC_26}}</w:t>
+        <w:t>{{anchor:FOL_CLAUSE_26_SHARING_AMONG_THE_FINANCE_PARTIES}}</w:t>
       </w:r>
     </w:p>
     <w:p/>
@@ -519,7 +519,7 @@
     </w:p>
     <w:p>
       <w:r>
-        <w:t>{{anchor:FOL_SEC_27}}</w:t>
+        <w:t>{{anchor:FOL_CLAUSE_27_PAYMENT_MECHANICS}}</w:t>
       </w:r>
     </w:p>
     <w:p/>
@@ -535,7 +535,7 @@
     </w:p>
     <w:p>
       <w:r>
-        <w:t>{{anchor:FOL_SEC_28}}</w:t>
+        <w:t>{{anchor:FOL_CLAUSE_28_SET_OFF}}</w:t>
       </w:r>
     </w:p>
     <w:p/>
@@ -551,7 +551,7 @@
     </w:p>
     <w:p>
       <w:r>
-        <w:t>{{anchor:FOL_SEC_29}}</w:t>
+        <w:t>{{anchor:FOL_CLAUSE_29_NOTICES}}</w:t>
       </w:r>
     </w:p>
     <w:p/>
@@ -567,114 +567,114 @@
     </w:p>
     <w:p>
       <w:r>
-        <w:t>{{anchor:FOL_SEC_30}}</w:t>
-      </w:r>
-    </w:p>
-    <w:p/>
-    <w:p>
-      <w:r>
-        <w:rPr>
-          <w:b w:val="on"/>
-          <w:sz w:val="22"/>
-          <w:rFonts w:ascii="Calibri" w:hAnsi="Calibri" w:cs="Calibri" w:eastAsia="Calibri"/>
-        </w:rPr>
-        <w:t>Schedule 1 — Facility Particulars</w:t>
-      </w:r>
-    </w:p>
-    <w:p>
-      <w:r>
-        <w:t>{{anchor:FOL_SCH_01}}</w:t>
-      </w:r>
-    </w:p>
-    <w:p/>
-    <w:p>
-      <w:r>
-        <w:rPr>
-          <w:b w:val="on"/>
-          <w:sz w:val="22"/>
-          <w:rFonts w:ascii="Calibri" w:hAnsi="Calibri" w:cs="Calibri" w:eastAsia="Calibri"/>
-        </w:rPr>
-        <w:t>Schedule 2 — Conditions Precedent</w:t>
-      </w:r>
-    </w:p>
-    <w:p>
-      <w:r>
-        <w:t>{{anchor:FOL_SCH_02}}</w:t>
-      </w:r>
-    </w:p>
-    <w:p/>
-    <w:p>
-      <w:r>
-        <w:rPr>
-          <w:b w:val="on"/>
-          <w:sz w:val="22"/>
-          <w:rFonts w:ascii="Calibri" w:hAnsi="Calibri" w:cs="Calibri" w:eastAsia="Calibri"/>
-        </w:rPr>
-        <w:t>Schedule 3 — Representations</w:t>
-      </w:r>
-    </w:p>
-    <w:p>
-      <w:r>
-        <w:t>{{anchor:FOL_SCH_03}}</w:t>
-      </w:r>
-    </w:p>
-    <w:p/>
-    <w:p>
-      <w:r>
-        <w:rPr>
-          <w:b w:val="on"/>
-          <w:sz w:val="22"/>
-          <w:rFonts w:ascii="Calibri" w:hAnsi="Calibri" w:cs="Calibri" w:eastAsia="Calibri"/>
-        </w:rPr>
-        <w:t>Schedule 4 — Form of Utilisation Request</w:t>
-      </w:r>
-    </w:p>
-    <w:p>
-      <w:r>
-        <w:t>{{anchor:FOL_SCH_04}}</w:t>
-      </w:r>
-    </w:p>
-    <w:p/>
-    <w:p>
-      <w:r>
-        <w:rPr>
-          <w:b w:val="on"/>
-          <w:sz w:val="22"/>
-          <w:rFonts w:ascii="Calibri" w:hAnsi="Calibri" w:cs="Calibri" w:eastAsia="Calibri"/>
-        </w:rPr>
-        <w:t>Schedule 5 — Fees</w:t>
-      </w:r>
-    </w:p>
-    <w:p>
-      <w:r>
-        <w:t>{{anchor:FOL_SCH_05}}</w:t>
-      </w:r>
-    </w:p>
-    <w:p/>
-    <w:p>
-      <w:r>
-        <w:rPr>
-          <w:b w:val="on"/>
-          <w:sz w:val="22"/>
-          <w:rFonts w:ascii="Calibri" w:hAnsi="Calibri" w:cs="Calibri" w:eastAsia="Calibri"/>
-        </w:rPr>
-        <w:t>Schedule 6 — Security Principles</w:t>
-      </w:r>
-    </w:p>
-    <w:p>
-      <w:r>
-        <w:t>{{anchor:FOL_SCH_06}}</w:t>
-      </w:r>
-    </w:p>
-    <w:p/>
-    <w:p>
-      <w:r>
-        <w:rPr>
-          <w:b w:val="on"/>
-          <w:sz w:val="22"/>
-          <w:rFonts w:ascii="Calibri" w:hAnsi="Calibri" w:cs="Calibri" w:eastAsia="Calibri"/>
-        </w:rPr>
-        <w:t>Execution — Borrower</w:t>
+        <w:t>{{anchor:FOL_CLAUSE_30_GOVERNING_LAW_AND_JURISDICTION}}</w:t>
+      </w:r>
+    </w:p>
+    <w:p/>
+    <w:p>
+      <w:r>
+        <w:rPr>
+          <w:b w:val="on"/>
+          <w:sz w:val="22"/>
+          <w:rFonts w:ascii="Calibri" w:hAnsi="Calibri" w:cs="Calibri" w:eastAsia="Calibri"/>
+        </w:rPr>
+        <w:t>Schedule 1 - Facility Particulars</w:t>
+      </w:r>
+    </w:p>
+    <w:p>
+      <w:r>
+        <w:t>{{anchor:FOL_SCHEDULE_01_FACILITY_PARTICULARS}}</w:t>
+      </w:r>
+    </w:p>
+    <w:p/>
+    <w:p>
+      <w:r>
+        <w:rPr>
+          <w:b w:val="on"/>
+          <w:sz w:val="22"/>
+          <w:rFonts w:ascii="Calibri" w:hAnsi="Calibri" w:cs="Calibri" w:eastAsia="Calibri"/>
+        </w:rPr>
+        <w:t>Schedule 2 - Conditions Precedent</w:t>
+      </w:r>
+    </w:p>
+    <w:p>
+      <w:r>
+        <w:t>{{anchor:FOL_SCHEDULE_02_CONDITIONS_PRECEDENT}}</w:t>
+      </w:r>
+    </w:p>
+    <w:p/>
+    <w:p>
+      <w:r>
+        <w:rPr>
+          <w:b w:val="on"/>
+          <w:sz w:val="22"/>
+          <w:rFonts w:ascii="Calibri" w:hAnsi="Calibri" w:cs="Calibri" w:eastAsia="Calibri"/>
+        </w:rPr>
+        <w:t>Schedule 3 - Representations</w:t>
+      </w:r>
+    </w:p>
+    <w:p>
+      <w:r>
+        <w:t>{{anchor:FOL_SCHEDULE_03_REPRESENTATIONS}}</w:t>
+      </w:r>
+    </w:p>
+    <w:p/>
+    <w:p>
+      <w:r>
+        <w:rPr>
+          <w:b w:val="on"/>
+          <w:sz w:val="22"/>
+          <w:rFonts w:ascii="Calibri" w:hAnsi="Calibri" w:cs="Calibri" w:eastAsia="Calibri"/>
+        </w:rPr>
+        <w:t>Schedule 4 - Form of Utilisation Request</w:t>
+      </w:r>
+    </w:p>
+    <w:p>
+      <w:r>
+        <w:t>{{anchor:FOL_SCHEDULE_04_FORM_OF_UTILISATION_REQUEST}}</w:t>
+      </w:r>
+    </w:p>
+    <w:p/>
+    <w:p>
+      <w:r>
+        <w:rPr>
+          <w:b w:val="on"/>
+          <w:sz w:val="22"/>
+          <w:rFonts w:ascii="Calibri" w:hAnsi="Calibri" w:cs="Calibri" w:eastAsia="Calibri"/>
+        </w:rPr>
+        <w:t>Schedule 5 - Fees</w:t>
+      </w:r>
+    </w:p>
+    <w:p>
+      <w:r>
+        <w:t>{{anchor:FOL_SCHEDULE_05_FEES}}</w:t>
+      </w:r>
+    </w:p>
+    <w:p/>
+    <w:p>
+      <w:r>
+        <w:rPr>
+          <w:b w:val="on"/>
+          <w:sz w:val="22"/>
+          <w:rFonts w:ascii="Calibri" w:hAnsi="Calibri" w:cs="Calibri" w:eastAsia="Calibri"/>
+        </w:rPr>
+        <w:t>Schedule 6 - Security Principles</w:t>
+      </w:r>
+    </w:p>
+    <w:p>
+      <w:r>
+        <w:t>{{anchor:FOL_SCHEDULE_06_SECURITY_PRINCIPLES}}</w:t>
+      </w:r>
+    </w:p>
+    <w:p/>
+    <w:p>
+      <w:r>
+        <w:rPr>
+          <w:b w:val="on"/>
+          <w:sz w:val="22"/>
+          <w:rFonts w:ascii="Calibri" w:hAnsi="Calibri" w:cs="Calibri" w:eastAsia="Calibri"/>
+        </w:rPr>
+        <w:t>Execution 鈥?Borrower</w:t>
       </w:r>
     </w:p>
     <w:p>
@@ -690,7 +690,7 @@
           <w:sz w:val="22"/>
           <w:rFonts w:ascii="Calibri" w:hAnsi="Calibri" w:cs="Calibri" w:eastAsia="Calibri"/>
         </w:rPr>
-        <w:t>Execution — Lenders / Agent</w:t>
+        <w:t>Execution 鈥?Lenders / Agent</w:t>
       </w:r>
     </w:p>
     <w:p>

</xml_diff>

<commit_message>
feat(P22): resolve C1-C3, dual-page numbering, demo package scaffolds
- Pass PdfConversionOptions explicitly through PDF pipeline (remove ThreadLocal)
- PdfPageStampResult + PDF_PAGE_NUMBER_STAMP_FAILED fidelity warning on stamp failure
- RenderProfile.pdfPageNumberStampingEnabled controls per-template PDF stamping
- FOL master: dual-page footer (SECTIONPAGES/NUMPAGES), section breaks (layout v5)
- BDD-DEMO-EXP-005/006 regression tests for dual-page DOCX fields and PDF stamping
- Scaffold deploy/demo-retail-account through demo-wealth with MasterDocxAssetGeneratorTest
- Add deploy/import-all-demos.ps1 and demo-import-shared.ps1
- Fix LibreOffice tests on Linux (fake-libreoffice.sh), catalogVersion 1.1 assertion
- mvn verify BUILD SUCCESS (718 tests, 1 skipped)

Co-authored-by: bigballgis <bigballgis@users.noreply.github.com>
</commit_message>
<xml_diff>
--- a/deploy/demo-fol/assets/wholesale-fol-master.docx
+++ b/deploy/demo-fol/assets/wholesale-fol-master.docx
@@ -219,6 +219,14 @@
       </w:r>
     </w:p>
     <w:p/>
+    <w:p>
+      <w:pPr>
+        <w:sectPr>
+          <w:type w:val="nextPage"/>
+          <w:pgNumType w:start="1"/>
+        </w:sectPr>
+      </w:pPr>
+    </w:p>
     <w:p>
       <w:r>
         <w:rPr>
@@ -733,13 +741,79 @@
         <w:sz w:val="16"/>
         <w:rFonts w:ascii="Calibri" w:hAnsi="Calibri" w:cs="Calibri" w:eastAsia="Calibri"/>
       </w:rPr>
-      <w:t xml:space="preserve">Page </w:t>
+      <w:t xml:space="preserve">Section Page </w:t>
     </w:r>
     <w:r>
       <w:fldChar w:fldCharType="begin"/>
     </w:r>
     <w:r>
       <w:instrText> PAGE \* MERGEFORMAT </w:instrText>
+    </w:r>
+    <w:r>
+      <w:fldChar w:fldCharType="separate"/>
+    </w:r>
+    <w:r>
+      <w:t>1</w:t>
+    </w:r>
+    <w:r>
+      <w:fldChar w:fldCharType="end"/>
+    </w:r>
+    <w:r>
+      <w:rPr>
+        <w:sz w:val="16"/>
+        <w:rFonts w:ascii="Calibri" w:hAnsi="Calibri" w:cs="Calibri" w:eastAsia="Calibri"/>
+      </w:rPr>
+      <w:t xml:space="preserve"> of </w:t>
+    </w:r>
+    <w:r>
+      <w:fldChar w:fldCharType="begin"/>
+    </w:r>
+    <w:r>
+      <w:instrText> SECTIONPAGES \* MERGEFORMAT </w:instrText>
+    </w:r>
+    <w:r>
+      <w:fldChar w:fldCharType="separate"/>
+    </w:r>
+    <w:r>
+      <w:t>1</w:t>
+    </w:r>
+    <w:r>
+      <w:fldChar w:fldCharType="end"/>
+    </w:r>
+    <w:r>
+      <w:rPr>
+        <w:sz w:val="16"/>
+        <w:rFonts w:ascii="Calibri" w:hAnsi="Calibri" w:cs="Calibri" w:eastAsia="Calibri"/>
+      </w:rPr>
+      <w:t xml:space="preserve">  |  Document Page </w:t>
+    </w:r>
+    <w:r>
+      <w:fldChar w:fldCharType="begin"/>
+    </w:r>
+    <w:r>
+      <w:instrText> PAGE \* MERGEFORMAT </w:instrText>
+    </w:r>
+    <w:r>
+      <w:fldChar w:fldCharType="separate"/>
+    </w:r>
+    <w:r>
+      <w:t>1</w:t>
+    </w:r>
+    <w:r>
+      <w:fldChar w:fldCharType="end"/>
+    </w:r>
+    <w:r>
+      <w:rPr>
+        <w:sz w:val="16"/>
+        <w:rFonts w:ascii="Calibri" w:hAnsi="Calibri" w:cs="Calibri" w:eastAsia="Calibri"/>
+      </w:rPr>
+      <w:t xml:space="preserve"> of </w:t>
+    </w:r>
+    <w:r>
+      <w:fldChar w:fldCharType="begin"/>
+    </w:r>
+    <w:r>
+      <w:instrText> NUMPAGES \* MERGEFORMAT </w:instrText>
     </w:r>
     <w:r>
       <w:fldChar w:fldCharType="separate"/>

</xml_diff>

<commit_message>
feat(demo): P23-T11 align FOL and full-flow with shared bank styles
Promote demo master DOCX support to main, add DemoRetailLetterheadDocxBuilder, regenerate FOL and E2E letterhead fixtures with POI style and footer assertions.

Co-authored-by: Cursor <cursoragent@cursor.com>
</commit_message>
<xml_diff>
--- a/deploy/demo-fol/assets/wholesale-fol-master.docx
+++ b/deploy/demo-fol/assets/wholesale-fol-master.docx
@@ -708,10 +708,10 @@
     </w:p>
     <w:p/>
     <w:sectPr>
-      <main:headerReference xmlns:main="http://schemas.openxmlformats.org/wordprocessingml/2006/main" xmlns:rel="http://schemas.openxmlformats.org/officeDocument/2006/relationships" main:type="default" rel:id="rId2"/>
-      <main:footerReference xmlns:main="http://schemas.openxmlformats.org/wordprocessingml/2006/main" xmlns:rel="http://schemas.openxmlformats.org/officeDocument/2006/relationships" main:type="default" rel:id="rId3"/>
+      <main:headerReference xmlns:main="http://schemas.openxmlformats.org/wordprocessingml/2006/main" xmlns:rel="http://schemas.openxmlformats.org/officeDocument/2006/relationships" main:type="default" rel:id="rId3"/>
+      <main:footerReference xmlns:main="http://schemas.openxmlformats.org/wordprocessingml/2006/main" xmlns:rel="http://schemas.openxmlformats.org/officeDocument/2006/relationships" main:type="default" rel:id="rId4"/>
       <main:pgSz xmlns:main="http://schemas.openxmlformats.org/wordprocessingml/2006/main" main:w="11906" main:h="16838"/>
-      <main:pgMar xmlns:main="http://schemas.openxmlformats.org/wordprocessingml/2006/main" main:top="1440" main:bottom="1440" main:left="1701" main:right="1276" main:header="708" main:footer="708" main:gutter="0"/>
+      <main:pgMar xmlns:main="http://schemas.openxmlformats.org/wordprocessingml/2006/main" main:top="1440" main:bottom="1440" main:left="1440" main:right="1440" main:header="708" main:footer="708" main:gutter="0"/>
     </w:sectPr>
   </w:body>
 </w:document>
@@ -834,6 +834,7 @@
         <w:sz w:val="14"/>
         <w:i w:val="on"/>
         <w:color w:val="888888"/>
+        <w:rFonts w:ascii="Calibri" w:hAnsi="Calibri" w:cs="Calibri" w:eastAsia="Calibri"/>
       </w:rPr>
       <w:t>Internal demonstration document — not an offer capable of acceptance</w:t>
     </w:r>
@@ -896,7 +897,7 @@
         <w:sz w:val="22"/>
         <w:szCs w:val="22"/>
         <w:color w:val="000000"/>
-        <w:lang w:val="en-US"/>
+        <w:lang w:val="en-US" w:bidi="en-US"/>
       </w:rPr>
     </w:rPrDefault>
     <w:pPrDefault>
@@ -914,5 +915,75 @@
       <w:lang w:val="en-US"/>
     </w:rPr>
   </w:style>
+  <w:style w:type="paragraph" w:styleId="Heading1">
+    <w:name w:val="Heading1"/>
+    <w:qFormat/>
+    <w:rPr>
+      <w:sz w:val="32"/>
+      <w:rFonts w:ascii="Cambria" w:hAnsi="Cambria" w:cs="Cambria"/>
+      <w:b/>
+    </w:rPr>
+  </w:style>
+  <w:style w:type="paragraph" w:styleId="Heading2">
+    <w:name w:val="Heading2"/>
+    <w:qFormat/>
+    <w:rPr>
+      <w:sz w:val="28"/>
+      <w:rFonts w:ascii="Cambria" w:hAnsi="Cambria" w:cs="Cambria"/>
+      <w:b/>
+    </w:rPr>
+  </w:style>
+  <w:style w:type="paragraph" w:styleId="Heading3">
+    <w:name w:val="Heading3"/>
+    <w:qFormat/>
+    <w:rPr>
+      <w:sz w:val="24"/>
+      <w:rFonts w:ascii="Cambria" w:hAnsi="Cambria" w:cs="Cambria"/>
+      <w:b/>
+    </w:rPr>
+  </w:style>
+  <w:style w:type="paragraph" w:styleId="ClauseBody">
+    <w:name w:val="ClauseBody"/>
+    <w:qFormat/>
+    <w:rPr>
+      <w:sz w:val="20"/>
+      <w:rFonts w:ascii="Calibri" w:hAnsi="Calibri" w:cs="Calibri"/>
+    </w:rPr>
+  </w:style>
+  <w:style w:type="paragraph" w:styleId="DefinedTerm">
+    <w:name w:val="DefinedTerm"/>
+    <w:qFormat/>
+    <w:rPr>
+      <w:sz w:val="20"/>
+      <w:rFonts w:ascii="Calibri" w:hAnsi="Calibri" w:cs="Calibri"/>
+      <w:b/>
+    </w:rPr>
+  </w:style>
+  <w:style w:type="paragraph" w:styleId="TableHeader">
+    <w:name w:val="TableHeader"/>
+    <w:qFormat/>
+    <w:rPr>
+      <w:sz w:val="20"/>
+      <w:rFonts w:ascii="Calibri" w:hAnsi="Calibri" w:cs="Calibri"/>
+      <w:b/>
+    </w:rPr>
+  </w:style>
+  <w:style w:type="paragraph" w:styleId="ScheduleTitle">
+    <w:name w:val="ScheduleTitle"/>
+    <w:qFormat/>
+    <w:rPr>
+      <w:sz w:val="26"/>
+      <w:rFonts w:ascii="Cambria" w:hAnsi="Cambria" w:cs="Cambria"/>
+      <w:b/>
+    </w:rPr>
+  </w:style>
+  <w:style w:type="paragraph" w:styleId="SignatureBlock">
+    <w:name w:val="SignatureBlock"/>
+    <w:qFormat/>
+    <w:rPr>
+      <w:sz w:val="20"/>
+      <w:rFonts w:ascii="Calibri" w:hAnsi="Calibri" w:cs="Calibri"/>
+    </w:rPr>
+  </w:style>
 </w:styles>
 </file>
</xml_diff>